<commit_message>
LA MARQUE 5부 12화 La rentabilité (+11화 한국어 표기 수정)
Co-Authored-By: Claude Opus 5.5 <noreply@anthropic.com>
Claude-Session: https://claude.ai/code/session_01N4vhCLeYxrjvGnDxQBD9Cq
</commit_message>
<xml_diff>
--- a/la-marque/대본/5부/11화_Ombelle.docx
+++ b/la-marque/대본/5부/11화_Ombelle.docx
@@ -3467,7 +3467,7 @@
         <w:pStyle w:val="BodyText"/>
       </w:pPr>
       <w:r>
-        <w:t xml:space="preserve">바스티앙: 봤어요. 아무 말도 안 했어요. 우리가 할 말이 아니었으니까요.</w:t>
+        <w:t xml:space="preserve">바스티앵: 봤어요. 아무 말도 안 했어요. 우리가 할 말이 아니었으니까요.</w:t>
       </w:r>
     </w:p>
     <w:p>
@@ -3605,7 +3605,7 @@
         <w:pStyle w:val="BodyText"/>
       </w:pPr>
       <w:r>
-        <w:t xml:space="preserve">바스티앙: 법원을 통해 직원을 인수하면 근속 연수는 유지돼요?</w:t>
+        <w:t xml:space="preserve">바스티앵: 법원을 통해 직원을 인수하면 근속 연수는 유지돼요?</w:t>
       </w:r>
     </w:p>
     <w:p>
@@ -3709,7 +3709,7 @@
         <w:pStyle w:val="BodyText"/>
       </w:pPr>
       <w:r>
-        <w:t xml:space="preserve">바스티앙: 옹벨의 인허가 서류요? 뭐 하러요? 그 젤은 넥살리스를 통해 하늘에서 왔는데.</w:t>
+        <w:t xml:space="preserve">바스티앵: 옹벨의 인허가 서류요? 뭐 하러요? 그 젤은 넥살리스를 통해 하늘에서 왔는데.</w:t>
       </w:r>
     </w:p>
     <w:p>
@@ -3887,7 +3887,7 @@
         <w:pStyle w:val="BodyText"/>
       </w:pPr>
       <w:r>
-        <w:t xml:space="preserve">바스티앙: 이상사례 신고는요? 누가 했어요?</w:t>
+        <w:t xml:space="preserve">바스티앵: 이상사례 신고는요? 누가 했어요?</w:t>
       </w:r>
     </w:p>
     <w:p>
@@ -3903,7 +3903,7 @@
         <w:pStyle w:val="BodyText"/>
       </w:pPr>
       <w:r>
-        <w:t xml:space="preserve">바스티앙: 신고서를 쓴 게 당신이에요?</w:t>
+        <w:t xml:space="preserve">바스티앵: 신고서를 쓴 게 당신이에요?</w:t>
       </w:r>
     </w:p>
     <w:p>
@@ -4315,7 +4315,7 @@
         <w:pStyle w:val="BodyText"/>
       </w:pPr>
       <w:r>
-        <w:t xml:space="preserve">바스티앙: 그리고 게랭 씨는 카미유 팀에 합류해요. 카미유가 그러더라고요. 「드디어 나보다 빨리 쓰는 사람이 왔네.」</w:t>
+        <w:t xml:space="preserve">바스티앵: 그리고 게랭 씨는 카미유 팀에 합류해요. 카미유가 그러더라고요. 「드디어 나보다 빨리 쓰는 사람이 왔네.」</w:t>
       </w:r>
     </w:p>
     <w:p>

</xml_diff>